<commit_message>
Dashboard created and changes in business requirement file
</commit_message>
<xml_diff>
--- a/Analysis Report.docx
+++ b/Analysis Report.docx
@@ -143,15 +143,13 @@
     </w:p>
     <w:p>
       <w:pPr>
-        <w:rPr>
-          <w:rFonts w:ascii="Arial" w:hAnsi="Arial" w:cs="Arial"/>
-        </w:rPr>
-      </w:pPr>
-    </w:p>
-    <w:p>
-      <w:pPr>
-        <w:rPr>
-          <w:rFonts w:ascii="Arial" w:hAnsi="Arial" w:cs="Arial"/>
+        <w:ind w:left="1080"/>
+      </w:pPr>
+    </w:p>
+    <w:p>
+      <w:pPr>
+        <w:rPr>
+          <w:noProof/>
         </w:rPr>
       </w:pPr>
       <w:r>
@@ -161,7 +159,7 @@
         <mc:AlternateContent>
           <mc:Choice Requires="wpg">
             <w:drawing>
-              <wp:inline distT="0" distB="0" distL="0" distR="0" wp14:anchorId="3D658A3A" wp14:editId="50BFE030">
+              <wp:inline distT="0" distB="0" distL="0" distR="0" wp14:anchorId="3D658A3A" wp14:editId="4FCF0C22">
                 <wp:extent cx="6268085" cy="879474"/>
                 <wp:effectExtent l="19050" t="19050" r="18415" b="16510"/>
                 <wp:docPr id="796704348" name="Group 1"/>
@@ -254,7 +252,7 @@
           </mc:Choice>
           <mc:Fallback>
             <w:pict>
-              <v:group w14:anchorId="74ABB845" id="Group 1" o:spid="_x0000_s1026" style="width:493.55pt;height:69.25pt;mso-position-horizontal-relative:char;mso-position-vertical-relative:line" coordorigin=",90" coordsize="41540,3922" o:gfxdata="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">
+              <v:group w14:anchorId="486D9E5E" id="Group 1" o:spid="_x0000_s1026" style="width:493.55pt;height:69.25pt;mso-position-horizontal-relative:char;mso-position-vertical-relative:line" coordorigin=",90" coordsize="41540,3922" o:gfxdata="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">
                 <v:shapetype id="_x0000_t75" coordsize="21600,21600" o:spt="75" o:preferrelative="t" path="m@4@5l@4@11@9@11@9@5xe" filled="f" stroked="f">
                   <v:stroke joinstyle="miter"/>
                   <v:formulas>
@@ -298,9 +296,77 @@
     <w:p>
       <w:pPr>
         <w:rPr>
-          <w:rFonts w:ascii="Arial" w:hAnsi="Arial" w:cs="Arial"/>
-        </w:rPr>
-      </w:pPr>
+          <w:noProof/>
+        </w:rPr>
+      </w:pPr>
+      <w:r>
+        <w:rPr>
+          <w:noProof/>
+        </w:rPr>
+        <w:drawing>
+          <wp:anchor distT="0" distB="0" distL="114300" distR="114300" simplePos="0" relativeHeight="251658240" behindDoc="1" locked="0" layoutInCell="1" allowOverlap="1" wp14:anchorId="25974B03" wp14:editId="733E06E1">
+            <wp:simplePos x="0" y="0"/>
+            <wp:positionH relativeFrom="column">
+              <wp:posOffset>4196726</wp:posOffset>
+            </wp:positionH>
+            <wp:positionV relativeFrom="paragraph">
+              <wp:posOffset>152345</wp:posOffset>
+            </wp:positionV>
+            <wp:extent cx="2371558" cy="1776962"/>
+            <wp:effectExtent l="19050" t="19050" r="10160" b="13970"/>
+            <wp:wrapNone/>
+            <wp:docPr id="790879696" name="Picture 1"/>
+            <wp:cNvGraphicFramePr>
+              <a:graphicFrameLocks xmlns:a="http://schemas.openxmlformats.org/drawingml/2006/main" noChangeAspect="1"/>
+            </wp:cNvGraphicFramePr>
+            <a:graphic xmlns:a="http://schemas.openxmlformats.org/drawingml/2006/main">
+              <a:graphicData uri="http://schemas.openxmlformats.org/drawingml/2006/picture">
+                <pic:pic xmlns:pic="http://schemas.openxmlformats.org/drawingml/2006/picture">
+                  <pic:nvPicPr>
+                    <pic:cNvPr id="0" name="Picture 1"/>
+                    <pic:cNvPicPr>
+                      <a:picLocks noChangeAspect="1" noChangeArrowheads="1"/>
+                    </pic:cNvPicPr>
+                  </pic:nvPicPr>
+                  <pic:blipFill>
+                    <a:blip r:embed="rId12" cstate="print">
+                      <a:extLst>
+                        <a:ext uri="{28A0092B-C50C-407E-A947-70E740481C1C}">
+                          <a14:useLocalDpi xmlns:a14="http://schemas.microsoft.com/office/drawing/2010/main" val="0"/>
+                        </a:ext>
+                      </a:extLst>
+                    </a:blip>
+                    <a:srcRect/>
+                    <a:stretch>
+                      <a:fillRect/>
+                    </a:stretch>
+                  </pic:blipFill>
+                  <pic:spPr bwMode="auto">
+                    <a:xfrm>
+                      <a:off x="0" y="0"/>
+                      <a:ext cx="2372026" cy="1777313"/>
+                    </a:xfrm>
+                    <a:prstGeom prst="rect">
+                      <a:avLst/>
+                    </a:prstGeom>
+                    <a:ln>
+                      <a:solidFill>
+                        <a:schemeClr val="tx1"/>
+                      </a:solidFill>
+                    </a:ln>
+                  </pic:spPr>
+                </pic:pic>
+              </a:graphicData>
+            </a:graphic>
+            <wp14:sizeRelH relativeFrom="margin">
+              <wp14:pctWidth>0</wp14:pctWidth>
+            </wp14:sizeRelH>
+            <wp14:sizeRelV relativeFrom="margin">
+              <wp14:pctHeight>0</wp14:pctHeight>
+            </wp14:sizeRelV>
+          </wp:anchor>
+        </w:drawing>
+      </w:r>
     </w:p>
     <w:p>
       <w:pPr>
@@ -448,7 +514,7 @@
                     <pic:cNvPicPr/>
                   </pic:nvPicPr>
                   <pic:blipFill>
-                    <a:blip r:embed="rId12">
+                    <a:blip r:embed="rId13">
                       <a:extLst>
                         <a:ext uri="{28A0092B-C50C-407E-A947-70E740481C1C}">
                           <a14:useLocalDpi xmlns:a14="http://schemas.microsoft.com/office/drawing/2010/main" val="0"/>
@@ -638,7 +704,7 @@
                     <pic:cNvPicPr/>
                   </pic:nvPicPr>
                   <pic:blipFill>
-                    <a:blip r:embed="rId13"/>
+                    <a:blip r:embed="rId14"/>
                     <a:stretch>
                       <a:fillRect/>
                     </a:stretch>
@@ -663,6 +729,63 @@
           </wp:inline>
         </w:drawing>
       </w:r>
+      <w:r>
+        <w:t xml:space="preserve"> </w:t>
+      </w:r>
+      <w:r>
+        <w:rPr>
+          <w:noProof/>
+        </w:rPr>
+        <w:drawing>
+          <wp:inline distT="0" distB="0" distL="0" distR="0" wp14:anchorId="54F3C78B" wp14:editId="0E3FF038">
+            <wp:extent cx="2260128" cy="1693468"/>
+            <wp:effectExtent l="19050" t="19050" r="26035" b="21590"/>
+            <wp:docPr id="141158372" name="Picture 2"/>
+            <wp:cNvGraphicFramePr>
+              <a:graphicFrameLocks xmlns:a="http://schemas.openxmlformats.org/drawingml/2006/main" noChangeAspect="1"/>
+            </wp:cNvGraphicFramePr>
+            <a:graphic xmlns:a="http://schemas.openxmlformats.org/drawingml/2006/main">
+              <a:graphicData uri="http://schemas.openxmlformats.org/drawingml/2006/picture">
+                <pic:pic xmlns:pic="http://schemas.openxmlformats.org/drawingml/2006/picture">
+                  <pic:nvPicPr>
+                    <pic:cNvPr id="0" name="Picture 3"/>
+                    <pic:cNvPicPr>
+                      <a:picLocks noChangeAspect="1" noChangeArrowheads="1"/>
+                    </pic:cNvPicPr>
+                  </pic:nvPicPr>
+                  <pic:blipFill>
+                    <a:blip r:embed="rId15" cstate="print">
+                      <a:extLst>
+                        <a:ext uri="{28A0092B-C50C-407E-A947-70E740481C1C}">
+                          <a14:useLocalDpi xmlns:a14="http://schemas.microsoft.com/office/drawing/2010/main" val="0"/>
+                        </a:ext>
+                      </a:extLst>
+                    </a:blip>
+                    <a:srcRect/>
+                    <a:stretch>
+                      <a:fillRect/>
+                    </a:stretch>
+                  </pic:blipFill>
+                  <pic:spPr bwMode="auto">
+                    <a:xfrm>
+                      <a:off x="0" y="0"/>
+                      <a:ext cx="2312014" cy="1732345"/>
+                    </a:xfrm>
+                    <a:prstGeom prst="rect">
+                      <a:avLst/>
+                    </a:prstGeom>
+                    <a:ln>
+                      <a:solidFill>
+                        <a:schemeClr val="tx1"/>
+                      </a:solidFill>
+                    </a:ln>
+                  </pic:spPr>
+                </pic:pic>
+              </a:graphicData>
+            </a:graphic>
+          </wp:inline>
+        </w:drawing>
+      </w:r>
     </w:p>
     <w:p/>
     <w:p>
@@ -892,7 +1015,7 @@
                     <pic:cNvPicPr/>
                   </pic:nvPicPr>
                   <pic:blipFill>
-                    <a:blip r:embed="rId14"/>
+                    <a:blip r:embed="rId16"/>
                     <a:stretch>
                       <a:fillRect/>
                     </a:stretch>
@@ -948,7 +1071,7 @@
                     <pic:cNvPicPr/>
                   </pic:nvPicPr>
                   <pic:blipFill>
-                    <a:blip r:embed="rId15"/>
+                    <a:blip r:embed="rId17"/>
                     <a:stretch>
                       <a:fillRect/>
                     </a:stretch>
@@ -1026,47 +1149,6 @@
           <w:bCs/>
         </w:rPr>
       </w:pPr>
-    </w:p>
-    <w:p>
-      <w:pPr>
-        <w:rPr>
-          <w:rFonts w:ascii="Arial" w:hAnsi="Arial" w:cs="Arial"/>
-          <w:b/>
-          <w:bCs/>
-        </w:rPr>
-      </w:pPr>
-      <w:r>
-        <w:rPr>
-          <w:rFonts w:ascii="Arial" w:hAnsi="Arial" w:cs="Arial"/>
-          <w:b/>
-          <w:bCs/>
-        </w:rPr>
-        <w:t xml:space="preserve">Overall Insight: </w:t>
-      </w:r>
-      <w:r>
-        <w:rPr>
-          <w:rFonts w:ascii="Arial" w:hAnsi="Arial" w:cs="Arial"/>
-        </w:rPr>
-        <w:t>Discounts are overused and do not meaningfully increase revenue or spending.</w:t>
-      </w:r>
-    </w:p>
-    <w:p>
-      <w:pPr>
-        <w:rPr>
-          <w:rFonts w:ascii="Arial" w:hAnsi="Arial" w:cs="Arial"/>
-          <w:b/>
-          <w:bCs/>
-        </w:rPr>
-      </w:pPr>
-    </w:p>
-    <w:p>
-      <w:pPr>
-        <w:rPr>
-          <w:rFonts w:ascii="Arial" w:hAnsi="Arial" w:cs="Arial"/>
-          <w:b/>
-          <w:bCs/>
-        </w:rPr>
-      </w:pPr>
       <w:r>
         <w:rPr>
           <w:rFonts w:ascii="Arial" w:hAnsi="Arial" w:cs="Arial"/>
@@ -1192,24 +1274,1695 @@
     </w:p>
     <w:p>
       <w:pPr>
-        <w:rPr>
-          <w:rFonts w:ascii="Arial" w:hAnsi="Arial" w:cs="Arial"/>
-        </w:rPr>
-      </w:pPr>
-    </w:p>
-    <w:p>
-      <w:pPr>
-        <w:rPr>
-          <w:rFonts w:ascii="Arial" w:hAnsi="Arial" w:cs="Arial"/>
-        </w:rPr>
-      </w:pPr>
-    </w:p>
-    <w:p>
-      <w:pPr>
-        <w:rPr>
-          <w:rFonts w:ascii="Arial" w:hAnsi="Arial" w:cs="Arial"/>
-        </w:rPr>
-      </w:pPr>
+        <w:pStyle w:val="Heading1"/>
+        <w:rPr>
+          <w:rFonts w:ascii="Arial" w:hAnsi="Arial" w:cs="Arial"/>
+          <w:b/>
+          <w:bCs/>
+          <w:color w:val="2E74B5" w:themeColor="accent1" w:themeShade="BF"/>
+          <w:sz w:val="28"/>
+          <w:szCs w:val="28"/>
+        </w:rPr>
+      </w:pPr>
+      <w:r>
+        <w:rPr>
+          <w:rFonts w:ascii="Arial" w:hAnsi="Arial" w:cs="Arial"/>
+          <w:b/>
+          <w:bCs/>
+          <w:color w:val="2E74B5" w:themeColor="accent1" w:themeShade="BF"/>
+          <w:sz w:val="28"/>
+          <w:szCs w:val="28"/>
+        </w:rPr>
+        <w:t>Customer Lifetime Value Strategy</w:t>
+      </w:r>
+      <w:r>
+        <w:rPr>
+          <w:rFonts w:ascii="Arial" w:hAnsi="Arial" w:cs="Arial"/>
+          <w:b/>
+          <w:bCs/>
+          <w:color w:val="2E74B5" w:themeColor="accent1" w:themeShade="BF"/>
+          <w:sz w:val="28"/>
+          <w:szCs w:val="28"/>
+        </w:rPr>
+        <w:t>:</w:t>
+      </w:r>
+    </w:p>
+    <w:p>
+      <w:r>
+        <w:rPr>
+          <w:rFonts w:ascii="Arial" w:hAnsi="Arial" w:cs="Arial"/>
+          <w:b/>
+          <w:bCs/>
+        </w:rPr>
+        <w:t>Age &amp; Gender Revenue Analysis</w:t>
+      </w:r>
+      <w:r>
+        <w:rPr>
+          <w:rFonts w:ascii="Arial" w:hAnsi="Arial" w:cs="Arial"/>
+          <w:b/>
+          <w:bCs/>
+        </w:rPr>
+        <w:t>:</w:t>
+      </w:r>
+    </w:p>
+    <w:p>
+      <w:pPr>
+        <w:pStyle w:val="ListParagraph"/>
+        <w:numPr>
+          <w:ilvl w:val="0"/>
+          <w:numId w:val="24"/>
+        </w:numPr>
+        <w:rPr>
+          <w:rFonts w:ascii="Arial" w:hAnsi="Arial" w:cs="Arial"/>
+          <w:b/>
+          <w:bCs/>
+        </w:rPr>
+      </w:pPr>
+      <w:r>
+        <w:rPr>
+          <w:rFonts w:ascii="Arial" w:hAnsi="Arial" w:cs="Arial"/>
+          <w:b/>
+          <w:bCs/>
+          <w:highlight w:val="yellow"/>
+        </w:rPr>
+        <w:t>Male – GenX: $103,128.93</w:t>
+      </w:r>
+    </w:p>
+    <w:p>
+      <w:pPr>
+        <w:pStyle w:val="ListParagraph"/>
+        <w:numPr>
+          <w:ilvl w:val="0"/>
+          <w:numId w:val="24"/>
+        </w:numPr>
+        <w:rPr>
+          <w:rFonts w:ascii="Arial" w:hAnsi="Arial" w:cs="Arial"/>
+        </w:rPr>
+      </w:pPr>
+      <w:r>
+        <w:rPr>
+          <w:rFonts w:ascii="Arial" w:hAnsi="Arial" w:cs="Arial"/>
+        </w:rPr>
+        <w:t>Male – GenY: $97,842.51</w:t>
+      </w:r>
+    </w:p>
+    <w:p>
+      <w:pPr>
+        <w:pStyle w:val="ListParagraph"/>
+        <w:numPr>
+          <w:ilvl w:val="0"/>
+          <w:numId w:val="24"/>
+        </w:numPr>
+        <w:rPr>
+          <w:rFonts w:ascii="Arial" w:hAnsi="Arial" w:cs="Arial"/>
+        </w:rPr>
+      </w:pPr>
+      <w:r>
+        <w:rPr>
+          <w:rFonts w:ascii="Arial" w:hAnsi="Arial" w:cs="Arial"/>
+        </w:rPr>
+        <w:t>Male – GenZ: $75,679.73</w:t>
+      </w:r>
+    </w:p>
+    <w:p>
+      <w:pPr>
+        <w:pStyle w:val="ListParagraph"/>
+        <w:numPr>
+          <w:ilvl w:val="0"/>
+          <w:numId w:val="24"/>
+        </w:numPr>
+        <w:rPr>
+          <w:rFonts w:ascii="Arial" w:hAnsi="Arial" w:cs="Arial"/>
+        </w:rPr>
+      </w:pPr>
+      <w:r>
+        <w:rPr>
+          <w:rFonts w:ascii="Arial" w:hAnsi="Arial" w:cs="Arial"/>
+        </w:rPr>
+        <w:t>Male – Boomers: $55,449.82</w:t>
+      </w:r>
+    </w:p>
+    <w:p>
+      <w:pPr>
+        <w:pStyle w:val="ListParagraph"/>
+        <w:numPr>
+          <w:ilvl w:val="0"/>
+          <w:numId w:val="24"/>
+        </w:numPr>
+        <w:rPr>
+          <w:rFonts w:ascii="Arial" w:hAnsi="Arial" w:cs="Arial"/>
+        </w:rPr>
+      </w:pPr>
+      <w:r>
+        <w:rPr>
+          <w:rFonts w:ascii="Arial" w:hAnsi="Arial" w:cs="Arial"/>
+        </w:rPr>
+        <w:t>Female – GenY: $50,750.71</w:t>
+      </w:r>
+    </w:p>
+    <w:p>
+      <w:pPr>
+        <w:pStyle w:val="ListParagraph"/>
+        <w:numPr>
+          <w:ilvl w:val="0"/>
+          <w:numId w:val="24"/>
+        </w:numPr>
+        <w:rPr>
+          <w:rFonts w:ascii="Arial" w:hAnsi="Arial" w:cs="Arial"/>
+        </w:rPr>
+      </w:pPr>
+      <w:r>
+        <w:rPr>
+          <w:rFonts w:ascii="Arial" w:hAnsi="Arial" w:cs="Arial"/>
+        </w:rPr>
+        <w:t>Female – GenX: $49,875.32</w:t>
+      </w:r>
+    </w:p>
+    <w:p>
+      <w:pPr>
+        <w:pStyle w:val="ListParagraph"/>
+        <w:numPr>
+          <w:ilvl w:val="0"/>
+          <w:numId w:val="24"/>
+        </w:numPr>
+        <w:rPr>
+          <w:rFonts w:ascii="Arial" w:hAnsi="Arial" w:cs="Arial"/>
+        </w:rPr>
+      </w:pPr>
+      <w:r>
+        <w:rPr>
+          <w:rFonts w:ascii="Arial" w:hAnsi="Arial" w:cs="Arial"/>
+        </w:rPr>
+        <w:t>Female – GenZ: $37,606.01</w:t>
+      </w:r>
+    </w:p>
+    <w:p>
+      <w:pPr>
+        <w:pStyle w:val="ListParagraph"/>
+        <w:numPr>
+          <w:ilvl w:val="0"/>
+          <w:numId w:val="24"/>
+        </w:numPr>
+        <w:rPr>
+          <w:rFonts w:ascii="Arial" w:hAnsi="Arial" w:cs="Arial"/>
+        </w:rPr>
+      </w:pPr>
+      <w:r>
+        <w:rPr>
+          <w:rFonts w:ascii="Arial" w:hAnsi="Arial" w:cs="Arial"/>
+        </w:rPr>
+        <w:t>Female – Boomers: $28,194.93</w:t>
+      </w:r>
+    </w:p>
+    <w:p>
+      <w:pPr>
+        <w:ind w:left="360"/>
+        <w:rPr>
+          <w:rFonts w:ascii="Arial" w:hAnsi="Arial" w:cs="Arial"/>
+        </w:rPr>
+      </w:pPr>
+    </w:p>
+    <w:p>
+      <w:pPr>
+        <w:rPr>
+          <w:rFonts w:ascii="Arial" w:hAnsi="Arial" w:cs="Arial"/>
+          <w:color w:val="2E74B5" w:themeColor="accent1" w:themeShade="BF"/>
+        </w:rPr>
+      </w:pPr>
+      <w:r>
+        <w:rPr>
+          <w:rFonts w:ascii="Arial" w:hAnsi="Arial" w:cs="Arial"/>
+          <w:b/>
+          <w:bCs/>
+          <w:color w:val="2E74B5" w:themeColor="accent1" w:themeShade="BF"/>
+        </w:rPr>
+        <w:t>Insight one:</w:t>
+      </w:r>
+      <w:r>
+        <w:rPr>
+          <w:rFonts w:ascii="Arial" w:hAnsi="Arial" w:cs="Arial"/>
+          <w:color w:val="2E74B5" w:themeColor="accent1" w:themeShade="BF"/>
+        </w:rPr>
+        <w:t xml:space="preserve"> </w:t>
+      </w:r>
+      <w:r>
+        <w:rPr>
+          <w:rFonts w:ascii="Arial" w:hAnsi="Arial" w:cs="Arial"/>
+          <w:color w:val="2E74B5" w:themeColor="accent1" w:themeShade="BF"/>
+        </w:rPr>
+        <w:t>Male customers across GenX</w:t>
+      </w:r>
+      <w:r>
+        <w:rPr>
+          <w:rFonts w:ascii="Arial" w:hAnsi="Arial" w:cs="Arial"/>
+          <w:color w:val="2E74B5" w:themeColor="accent1" w:themeShade="BF"/>
+        </w:rPr>
+        <w:t>(age:46-61)</w:t>
+      </w:r>
+      <w:r>
+        <w:rPr>
+          <w:rFonts w:ascii="Arial" w:hAnsi="Arial" w:cs="Arial"/>
+          <w:color w:val="2E74B5" w:themeColor="accent1" w:themeShade="BF"/>
+        </w:rPr>
+        <w:t xml:space="preserve"> and GenY</w:t>
+      </w:r>
+      <w:r>
+        <w:rPr>
+          <w:rFonts w:ascii="Arial" w:hAnsi="Arial" w:cs="Arial"/>
+          <w:color w:val="2E74B5" w:themeColor="accent1" w:themeShade="BF"/>
+        </w:rPr>
+        <w:t>(age:30-45)</w:t>
+      </w:r>
+      <w:r>
+        <w:rPr>
+          <w:rFonts w:ascii="Arial" w:hAnsi="Arial" w:cs="Arial"/>
+          <w:color w:val="2E74B5" w:themeColor="accent1" w:themeShade="BF"/>
+        </w:rPr>
+        <w:t xml:space="preserve"> generate the highest total revenue.</w:t>
+      </w:r>
+    </w:p>
+    <w:p>
+      <w:pPr>
+        <w:rPr>
+          <w:rFonts w:ascii="Arial" w:hAnsi="Arial" w:cs="Arial"/>
+          <w:color w:val="2E74B5" w:themeColor="accent1" w:themeShade="BF"/>
+        </w:rPr>
+      </w:pPr>
+    </w:p>
+    <w:p>
+      <w:r>
+        <w:rPr>
+          <w:rFonts w:ascii="Arial" w:hAnsi="Arial" w:cs="Arial"/>
+          <w:b/>
+          <w:bCs/>
+        </w:rPr>
+        <w:t>Subscription &amp; Purchase Frequency Analysis</w:t>
+      </w:r>
+      <w:r>
+        <w:rPr>
+          <w:rFonts w:ascii="Arial" w:hAnsi="Arial" w:cs="Arial"/>
+          <w:b/>
+          <w:bCs/>
+        </w:rPr>
+        <w:t>:</w:t>
+      </w:r>
+    </w:p>
+    <w:p>
+      <w:pPr>
+        <w:pStyle w:val="ListParagraph"/>
+        <w:numPr>
+          <w:ilvl w:val="0"/>
+          <w:numId w:val="24"/>
+        </w:numPr>
+        <w:rPr>
+          <w:rFonts w:ascii="Arial" w:hAnsi="Arial" w:cs="Arial"/>
+        </w:rPr>
+      </w:pPr>
+      <w:r>
+        <w:rPr>
+          <w:rFonts w:ascii="Arial" w:hAnsi="Arial" w:cs="Arial"/>
+          <w:b/>
+          <w:bCs/>
+        </w:rPr>
+        <w:t>Subscribed customers purchase amount and Non Subscribe puchase Puchase</w:t>
+      </w:r>
+    </w:p>
+    <w:p>
+      <w:pPr>
+        <w:pStyle w:val="ListParagraph"/>
+        <w:numPr>
+          <w:ilvl w:val="0"/>
+          <w:numId w:val="24"/>
+        </w:numPr>
+        <w:rPr>
+          <w:rFonts w:ascii="Arial" w:hAnsi="Arial" w:cs="Arial"/>
+        </w:rPr>
+      </w:pPr>
+      <w:r>
+        <w:rPr>
+          <w:rFonts w:ascii="Arial" w:hAnsi="Arial" w:cs="Arial"/>
+        </w:rPr>
+        <w:t>Subscribed customers do not significantly outperform non-subscribed customers in average purchase amount (~$60 across segments).</w:t>
+      </w:r>
+    </w:p>
+    <w:p>
+      <w:pPr>
+        <w:pStyle w:val="ListParagraph"/>
+        <w:numPr>
+          <w:ilvl w:val="0"/>
+          <w:numId w:val="24"/>
+        </w:numPr>
+        <w:rPr>
+          <w:rFonts w:ascii="Arial" w:hAnsi="Arial" w:cs="Arial"/>
+        </w:rPr>
+      </w:pPr>
+      <w:r>
+        <w:rPr>
+          <w:rFonts w:ascii="Arial" w:hAnsi="Arial" w:cs="Arial"/>
+        </w:rPr>
+        <w:t>Order volume is higher among non-subscribed customers.</w:t>
+      </w:r>
+    </w:p>
+    <w:p>
+      <w:pPr>
+        <w:rPr>
+          <w:rFonts w:ascii="Arial" w:hAnsi="Arial" w:cs="Arial"/>
+        </w:rPr>
+      </w:pPr>
+    </w:p>
+    <w:p>
+      <w:pPr>
+        <w:rPr>
+          <w:rFonts w:ascii="Arial" w:hAnsi="Arial" w:cs="Arial"/>
+          <w:color w:val="2E74B5" w:themeColor="accent1" w:themeShade="BF"/>
+        </w:rPr>
+      </w:pPr>
+      <w:r>
+        <w:rPr>
+          <w:rFonts w:ascii="Arial" w:hAnsi="Arial" w:cs="Arial"/>
+          <w:b/>
+          <w:bCs/>
+          <w:color w:val="2E74B5" w:themeColor="accent1" w:themeShade="BF"/>
+        </w:rPr>
+        <w:t xml:space="preserve">Insight </w:t>
+      </w:r>
+      <w:r>
+        <w:rPr>
+          <w:rFonts w:ascii="Arial" w:hAnsi="Arial" w:cs="Arial"/>
+          <w:b/>
+          <w:bCs/>
+          <w:color w:val="2E74B5" w:themeColor="accent1" w:themeShade="BF"/>
+        </w:rPr>
+        <w:t>Two</w:t>
+      </w:r>
+      <w:r>
+        <w:rPr>
+          <w:rFonts w:ascii="Arial" w:hAnsi="Arial" w:cs="Arial"/>
+          <w:b/>
+          <w:bCs/>
+          <w:color w:val="2E74B5" w:themeColor="accent1" w:themeShade="BF"/>
+        </w:rPr>
+        <w:t>:</w:t>
+      </w:r>
+      <w:r>
+        <w:rPr>
+          <w:rFonts w:ascii="Arial" w:hAnsi="Arial" w:cs="Arial"/>
+          <w:color w:val="2E74B5" w:themeColor="accent1" w:themeShade="BF"/>
+        </w:rPr>
+        <w:t xml:space="preserve"> </w:t>
+      </w:r>
+      <w:r>
+        <w:rPr>
+          <w:rFonts w:ascii="Arial" w:hAnsi="Arial" w:cs="Arial"/>
+          <w:color w:val="2E74B5" w:themeColor="accent1" w:themeShade="BF"/>
+        </w:rPr>
+        <w:t>Subscription status does not significantly increase purchase frequency or basket size.</w:t>
+      </w:r>
+    </w:p>
+    <w:p>
+      <w:pPr>
+        <w:rPr>
+          <w:rFonts w:ascii="Arial" w:hAnsi="Arial" w:cs="Arial"/>
+          <w:color w:val="2E74B5" w:themeColor="accent1" w:themeShade="BF"/>
+        </w:rPr>
+      </w:pPr>
+    </w:p>
+    <w:p>
+      <w:r>
+        <w:rPr>
+          <w:rFonts w:ascii="Arial" w:hAnsi="Arial" w:cs="Arial"/>
+          <w:b/>
+          <w:bCs/>
+        </w:rPr>
+        <w:t>Previous Purchases vs Spending Correlation</w:t>
+      </w:r>
+    </w:p>
+    <w:p>
+      <w:pPr>
+        <w:pStyle w:val="ListParagraph"/>
+        <w:numPr>
+          <w:ilvl w:val="0"/>
+          <w:numId w:val="24"/>
+        </w:numPr>
+        <w:rPr>
+          <w:rFonts w:ascii="Arial" w:hAnsi="Arial" w:cs="Arial"/>
+        </w:rPr>
+      </w:pPr>
+      <w:r>
+        <w:rPr>
+          <w:rFonts w:ascii="Arial" w:hAnsi="Arial" w:cs="Arial"/>
+        </w:rPr>
+        <w:t>Correlation between Previous Purchases and Spending: –0.01</w:t>
+      </w:r>
+    </w:p>
+    <w:p>
+      <w:pPr>
+        <w:rPr>
+          <w:rFonts w:ascii="Arial" w:hAnsi="Arial" w:cs="Arial"/>
+        </w:rPr>
+      </w:pPr>
+    </w:p>
+    <w:p>
+      <w:pPr>
+        <w:rPr>
+          <w:rFonts w:ascii="Arial" w:hAnsi="Arial" w:cs="Arial"/>
+          <w:color w:val="2E74B5" w:themeColor="accent1" w:themeShade="BF"/>
+        </w:rPr>
+      </w:pPr>
+      <w:r>
+        <w:rPr>
+          <w:rFonts w:ascii="Arial" w:hAnsi="Arial" w:cs="Arial"/>
+          <w:b/>
+          <w:bCs/>
+          <w:color w:val="2E74B5" w:themeColor="accent1" w:themeShade="BF"/>
+        </w:rPr>
+        <w:t xml:space="preserve">Insight </w:t>
+      </w:r>
+      <w:r>
+        <w:rPr>
+          <w:rFonts w:ascii="Arial" w:hAnsi="Arial" w:cs="Arial"/>
+          <w:b/>
+          <w:bCs/>
+          <w:color w:val="2E74B5" w:themeColor="accent1" w:themeShade="BF"/>
+        </w:rPr>
+        <w:t>Three</w:t>
+      </w:r>
+      <w:r>
+        <w:rPr>
+          <w:rFonts w:ascii="Arial" w:hAnsi="Arial" w:cs="Arial"/>
+          <w:b/>
+          <w:bCs/>
+          <w:color w:val="2E74B5" w:themeColor="accent1" w:themeShade="BF"/>
+        </w:rPr>
+        <w:t>:</w:t>
+      </w:r>
+      <w:r>
+        <w:rPr>
+          <w:rFonts w:ascii="Arial" w:hAnsi="Arial" w:cs="Arial"/>
+          <w:color w:val="2E74B5" w:themeColor="accent1" w:themeShade="BF"/>
+        </w:rPr>
+        <w:t xml:space="preserve"> </w:t>
+      </w:r>
+      <w:r>
+        <w:rPr>
+          <w:rFonts w:ascii="Arial" w:hAnsi="Arial" w:cs="Arial"/>
+          <w:color w:val="2E74B5" w:themeColor="accent1" w:themeShade="BF"/>
+        </w:rPr>
+        <w:t>There is no meaningful relationship between purchase history and spending.</w:t>
+      </w:r>
+    </w:p>
+    <w:p>
+      <w:r>
+        <w:rPr>
+          <w:rFonts w:ascii="Arial" w:hAnsi="Arial" w:cs="Arial"/>
+          <w:b/>
+          <w:bCs/>
+        </w:rPr>
+        <w:t>KPI</w:t>
+      </w:r>
+    </w:p>
+    <w:p>
+      <w:pPr>
+        <w:pStyle w:val="ListParagraph"/>
+        <w:numPr>
+          <w:ilvl w:val="0"/>
+          <w:numId w:val="24"/>
+        </w:numPr>
+        <w:rPr>
+          <w:rFonts w:ascii="Arial" w:hAnsi="Arial" w:cs="Arial"/>
+        </w:rPr>
+      </w:pPr>
+      <w:r>
+        <w:rPr>
+          <w:rFonts w:ascii="Arial" w:hAnsi="Arial" w:cs="Arial"/>
+        </w:rPr>
+        <w:t>Average Lifetime Spend per Customer</w:t>
+      </w:r>
+      <w:r>
+        <w:rPr>
+          <w:rFonts w:ascii="Arial" w:hAnsi="Arial" w:cs="Arial"/>
+        </w:rPr>
+        <w:t xml:space="preserve">: </w:t>
+      </w:r>
+      <w:r>
+        <w:rPr>
+          <w:rFonts w:ascii="Arial" w:hAnsi="Arial" w:cs="Arial"/>
+        </w:rPr>
+        <w:t>$127.8</w:t>
+      </w:r>
+    </w:p>
+    <w:p>
+      <w:pPr>
+        <w:pStyle w:val="ListParagraph"/>
+        <w:numPr>
+          <w:ilvl w:val="0"/>
+          <w:numId w:val="24"/>
+        </w:numPr>
+        <w:rPr>
+          <w:rFonts w:ascii="Arial" w:hAnsi="Arial" w:cs="Arial"/>
+        </w:rPr>
+      </w:pPr>
+      <w:r>
+        <w:rPr>
+          <w:rFonts w:ascii="Arial" w:hAnsi="Arial" w:cs="Arial"/>
+        </w:rPr>
+        <w:t>Purchase Frequency Distribution</w:t>
+      </w:r>
+    </w:p>
+    <w:p>
+      <w:pPr>
+        <w:pStyle w:val="ListParagraph"/>
+        <w:numPr>
+          <w:ilvl w:val="3"/>
+          <w:numId w:val="34"/>
+        </w:numPr>
+        <w:rPr>
+          <w:rFonts w:ascii="Arial" w:hAnsi="Arial" w:cs="Arial"/>
+        </w:rPr>
+      </w:pPr>
+      <w:r>
+        <w:rPr>
+          <w:rFonts w:ascii="Arial" w:hAnsi="Arial" w:cs="Arial"/>
+        </w:rPr>
+        <w:t>Every 3 Months – 1,253 customers</w:t>
+      </w:r>
+    </w:p>
+    <w:p>
+      <w:pPr>
+        <w:pStyle w:val="ListParagraph"/>
+        <w:numPr>
+          <w:ilvl w:val="3"/>
+          <w:numId w:val="34"/>
+        </w:numPr>
+        <w:rPr>
+          <w:rFonts w:ascii="Arial" w:hAnsi="Arial" w:cs="Arial"/>
+        </w:rPr>
+      </w:pPr>
+      <w:r>
+        <w:rPr>
+          <w:rFonts w:ascii="Arial" w:hAnsi="Arial" w:cs="Arial"/>
+        </w:rPr>
+        <w:lastRenderedPageBreak/>
+        <w:t>Annually – 1,211 customers</w:t>
+      </w:r>
+    </w:p>
+    <w:p>
+      <w:pPr>
+        <w:pStyle w:val="ListParagraph"/>
+        <w:numPr>
+          <w:ilvl w:val="3"/>
+          <w:numId w:val="34"/>
+        </w:numPr>
+        <w:rPr>
+          <w:rFonts w:ascii="Arial" w:hAnsi="Arial" w:cs="Arial"/>
+        </w:rPr>
+      </w:pPr>
+      <w:r>
+        <w:rPr>
+          <w:rFonts w:ascii="Arial" w:hAnsi="Arial" w:cs="Arial"/>
+        </w:rPr>
+        <w:t>Quarterly – 1,196 customers</w:t>
+      </w:r>
+    </w:p>
+    <w:p>
+      <w:pPr>
+        <w:pStyle w:val="ListParagraph"/>
+        <w:numPr>
+          <w:ilvl w:val="3"/>
+          <w:numId w:val="34"/>
+        </w:numPr>
+        <w:rPr>
+          <w:rFonts w:ascii="Arial" w:hAnsi="Arial" w:cs="Arial"/>
+        </w:rPr>
+      </w:pPr>
+      <w:r>
+        <w:rPr>
+          <w:rFonts w:ascii="Arial" w:hAnsi="Arial" w:cs="Arial"/>
+        </w:rPr>
+        <w:t>Monthly – 1,173 customers</w:t>
+      </w:r>
+    </w:p>
+    <w:p>
+      <w:pPr>
+        <w:pStyle w:val="ListParagraph"/>
+        <w:numPr>
+          <w:ilvl w:val="0"/>
+          <w:numId w:val="24"/>
+        </w:numPr>
+        <w:rPr>
+          <w:rFonts w:ascii="Arial" w:hAnsi="Arial" w:cs="Arial"/>
+        </w:rPr>
+      </w:pPr>
+      <w:r>
+        <w:rPr>
+          <w:rFonts w:ascii="Arial" w:hAnsi="Arial" w:cs="Arial"/>
+        </w:rPr>
+        <w:t>High-Value Customer Share: 20%</w:t>
+      </w:r>
+    </w:p>
+    <w:p>
+      <w:pPr>
+        <w:rPr>
+          <w:rFonts w:ascii="Arial" w:hAnsi="Arial" w:cs="Arial"/>
+        </w:rPr>
+      </w:pPr>
+    </w:p>
+    <w:p>
+      <w:pPr>
+        <w:rPr>
+          <w:rFonts w:ascii="Arial" w:hAnsi="Arial" w:cs="Arial"/>
+        </w:rPr>
+      </w:pPr>
+    </w:p>
+    <w:p>
+      <w:pPr>
+        <w:rPr>
+          <w:rFonts w:ascii="Arial" w:hAnsi="Arial" w:cs="Arial"/>
+          <w:color w:val="2E74B5" w:themeColor="accent1" w:themeShade="BF"/>
+        </w:rPr>
+      </w:pPr>
+      <w:r>
+        <w:rPr>
+          <w:rFonts w:ascii="Arial" w:hAnsi="Arial" w:cs="Arial"/>
+          <w:b/>
+          <w:bCs/>
+          <w:color w:val="2E74B5" w:themeColor="accent1" w:themeShade="BF"/>
+        </w:rPr>
+        <w:t xml:space="preserve">Insight </w:t>
+      </w:r>
+      <w:r>
+        <w:rPr>
+          <w:rFonts w:ascii="Arial" w:hAnsi="Arial" w:cs="Arial"/>
+          <w:b/>
+          <w:bCs/>
+          <w:color w:val="2E74B5" w:themeColor="accent1" w:themeShade="BF"/>
+        </w:rPr>
+        <w:t>Four</w:t>
+      </w:r>
+      <w:r>
+        <w:rPr>
+          <w:rFonts w:ascii="Arial" w:hAnsi="Arial" w:cs="Arial"/>
+          <w:b/>
+          <w:bCs/>
+          <w:color w:val="2E74B5" w:themeColor="accent1" w:themeShade="BF"/>
+        </w:rPr>
+        <w:t>:</w:t>
+      </w:r>
+      <w:r>
+        <w:rPr>
+          <w:rFonts w:ascii="Arial" w:hAnsi="Arial" w:cs="Arial"/>
+          <w:color w:val="2E74B5" w:themeColor="accent1" w:themeShade="BF"/>
+        </w:rPr>
+        <w:t xml:space="preserve"> </w:t>
+      </w:r>
+      <w:r>
+        <w:rPr>
+          <w:rFonts w:ascii="Arial" w:hAnsi="Arial" w:cs="Arial"/>
+          <w:color w:val="2E74B5" w:themeColor="accent1" w:themeShade="BF"/>
+        </w:rPr>
+        <w:t>A small group (top 20%) contributes disproportionately higher value.</w:t>
+      </w:r>
+    </w:p>
+    <w:p>
+      <w:pPr>
+        <w:rPr>
+          <w:rFonts w:ascii="Arial" w:hAnsi="Arial" w:cs="Arial"/>
+          <w:color w:val="2E74B5" w:themeColor="accent1" w:themeShade="BF"/>
+        </w:rPr>
+      </w:pPr>
+      <w:r>
+        <w:rPr>
+          <w:rFonts w:ascii="Arial" w:hAnsi="Arial" w:cs="Arial"/>
+          <w:color w:val="2E74B5" w:themeColor="accent1" w:themeShade="BF"/>
+        </w:rPr>
+        <w:t>This is the most strategically important segment.</w:t>
+      </w:r>
+    </w:p>
+    <w:p>
+      <w:pPr>
+        <w:rPr>
+          <w:rFonts w:ascii="Arial" w:hAnsi="Arial" w:cs="Arial"/>
+          <w:color w:val="2E74B5" w:themeColor="accent1" w:themeShade="BF"/>
+        </w:rPr>
+      </w:pPr>
+    </w:p>
+    <w:p>
+      <w:pPr>
+        <w:rPr>
+          <w:rFonts w:ascii="Arial" w:hAnsi="Arial" w:cs="Arial"/>
+          <w:b/>
+          <w:bCs/>
+        </w:rPr>
+      </w:pPr>
+      <w:r>
+        <w:rPr>
+          <w:rFonts w:ascii="Arial" w:hAnsi="Arial" w:cs="Arial"/>
+          <w:b/>
+          <w:bCs/>
+        </w:rPr>
+        <w:t>Recommendations to</w:t>
+      </w:r>
+      <w:r>
+        <w:rPr>
+          <w:rFonts w:ascii="Arial" w:hAnsi="Arial" w:cs="Arial"/>
+          <w:b/>
+          <w:bCs/>
+        </w:rPr>
+        <w:t xml:space="preserve"> Customer segments</w:t>
+      </w:r>
+      <w:r>
+        <w:rPr>
+          <w:rFonts w:ascii="Arial" w:hAnsi="Arial" w:cs="Arial"/>
+          <w:b/>
+          <w:bCs/>
+        </w:rPr>
+        <w:t>:</w:t>
+      </w:r>
+    </w:p>
+    <w:p>
+      <w:pPr>
+        <w:pStyle w:val="ListParagraph"/>
+        <w:numPr>
+          <w:ilvl w:val="0"/>
+          <w:numId w:val="26"/>
+        </w:numPr>
+        <w:rPr>
+          <w:rFonts w:ascii="Arial" w:hAnsi="Arial" w:cs="Arial"/>
+        </w:rPr>
+      </w:pPr>
+      <w:r>
+        <w:rPr>
+          <w:rFonts w:ascii="Arial" w:hAnsi="Arial" w:cs="Arial"/>
+        </w:rPr>
+        <w:t>Focus personalized campaigns on GenX &amp; GenY male customers</w:t>
+      </w:r>
+    </w:p>
+    <w:p>
+      <w:pPr>
+        <w:pStyle w:val="ListParagraph"/>
+        <w:numPr>
+          <w:ilvl w:val="0"/>
+          <w:numId w:val="26"/>
+        </w:numPr>
+        <w:rPr>
+          <w:rFonts w:ascii="Arial" w:hAnsi="Arial" w:cs="Arial"/>
+        </w:rPr>
+      </w:pPr>
+      <w:r>
+        <w:rPr>
+          <w:rFonts w:ascii="Arial" w:hAnsi="Arial" w:cs="Arial"/>
+        </w:rPr>
+        <w:t>Identify customers above the $83.94 average spend threshold</w:t>
+      </w:r>
+    </w:p>
+    <w:p>
+      <w:pPr>
+        <w:rPr>
+          <w:rFonts w:ascii="Arial" w:hAnsi="Arial" w:cs="Arial"/>
+        </w:rPr>
+      </w:pPr>
+    </w:p>
+    <w:p>
+      <w:pPr>
+        <w:tabs>
+          <w:tab w:val="left" w:pos="3221"/>
+        </w:tabs>
+        <w:rPr>
+          <w:rFonts w:ascii="Arial" w:hAnsi="Arial" w:cs="Arial"/>
+          <w:b/>
+          <w:bCs/>
+        </w:rPr>
+      </w:pPr>
+      <w:r>
+        <w:rPr>
+          <w:rFonts w:ascii="Arial" w:hAnsi="Arial" w:cs="Arial"/>
+          <w:b/>
+          <w:bCs/>
+        </w:rPr>
+        <w:t>Conclusion:</w:t>
+      </w:r>
+    </w:p>
+    <w:p>
+      <w:pPr>
+        <w:rPr>
+          <w:rFonts w:ascii="Arial" w:hAnsi="Arial" w:cs="Arial"/>
+        </w:rPr>
+      </w:pPr>
+      <w:r>
+        <w:rPr>
+          <w:rFonts w:ascii="Arial" w:hAnsi="Arial" w:cs="Arial"/>
+        </w:rPr>
+        <w:t>Customer lifetime value is concentrated within specific demographic segments rather than being evenly distributed. Since subscription and repeat purchases do not significantly increase per-order spending, revenue growth should focus on identifying and nurturing high-value customer segments through personalized engagement strategies rather than broad discount-based campaigns.</w:t>
+      </w:r>
+    </w:p>
+    <w:p>
+      <w:pPr>
+        <w:rPr>
+          <w:rFonts w:ascii="Arial" w:hAnsi="Arial" w:cs="Arial"/>
+        </w:rPr>
+      </w:pPr>
+    </w:p>
+    <w:p>
+      <w:pPr>
+        <w:pStyle w:val="Heading1"/>
+        <w:rPr>
+          <w:rFonts w:ascii="Arial" w:hAnsi="Arial" w:cs="Arial"/>
+          <w:b/>
+          <w:bCs/>
+          <w:color w:val="2E74B5" w:themeColor="accent1" w:themeShade="BF"/>
+          <w:sz w:val="28"/>
+          <w:szCs w:val="28"/>
+        </w:rPr>
+      </w:pPr>
+      <w:r>
+        <w:rPr>
+          <w:rFonts w:ascii="Arial" w:hAnsi="Arial" w:cs="Arial"/>
+          <w:b/>
+          <w:bCs/>
+          <w:color w:val="2E74B5" w:themeColor="accent1" w:themeShade="BF"/>
+          <w:sz w:val="28"/>
+          <w:szCs w:val="28"/>
+        </w:rPr>
+        <w:t>Inventory Optimization Strategy</w:t>
+      </w:r>
+      <w:r>
+        <w:rPr>
+          <w:rFonts w:ascii="Arial" w:hAnsi="Arial" w:cs="Arial"/>
+          <w:b/>
+          <w:bCs/>
+          <w:color w:val="2E74B5" w:themeColor="accent1" w:themeShade="BF"/>
+          <w:sz w:val="28"/>
+          <w:szCs w:val="28"/>
+        </w:rPr>
+        <w:t>:</w:t>
+      </w:r>
+    </w:p>
+    <w:p>
+      <w:r>
+        <w:rPr>
+          <w:rFonts w:ascii="Arial" w:hAnsi="Arial" w:cs="Arial"/>
+          <w:b/>
+          <w:bCs/>
+        </w:rPr>
+        <w:t>Age &amp; Gender Revenue Analysis</w:t>
+      </w:r>
+      <w:r>
+        <w:rPr>
+          <w:rFonts w:ascii="Arial" w:hAnsi="Arial" w:cs="Arial"/>
+          <w:b/>
+          <w:bCs/>
+        </w:rPr>
+        <w:t>:</w:t>
+      </w:r>
+    </w:p>
+    <w:p>
+      <w:pPr>
+        <w:pStyle w:val="ListParagraph"/>
+        <w:numPr>
+          <w:ilvl w:val="0"/>
+          <w:numId w:val="24"/>
+        </w:numPr>
+        <w:rPr>
+          <w:rFonts w:ascii="Arial" w:hAnsi="Arial" w:cs="Arial"/>
+          <w:b/>
+          <w:bCs/>
+        </w:rPr>
+      </w:pPr>
+      <w:r>
+        <w:rPr>
+          <w:rFonts w:ascii="Arial" w:hAnsi="Arial" w:cs="Arial"/>
+          <w:b/>
+          <w:bCs/>
+          <w:highlight w:val="yellow"/>
+        </w:rPr>
+        <w:t>Male – GenX: $103,128.93</w:t>
+      </w:r>
+    </w:p>
+    <w:p>
+      <w:pPr>
+        <w:pStyle w:val="ListParagraph"/>
+        <w:numPr>
+          <w:ilvl w:val="0"/>
+          <w:numId w:val="24"/>
+        </w:numPr>
+        <w:rPr>
+          <w:rFonts w:ascii="Arial" w:hAnsi="Arial" w:cs="Arial"/>
+        </w:rPr>
+      </w:pPr>
+      <w:r>
+        <w:rPr>
+          <w:rFonts w:ascii="Arial" w:hAnsi="Arial" w:cs="Arial"/>
+        </w:rPr>
+        <w:t>Male – GenY: $97,842.51</w:t>
+      </w:r>
+    </w:p>
+    <w:p>
+      <w:pPr>
+        <w:pStyle w:val="ListParagraph"/>
+        <w:numPr>
+          <w:ilvl w:val="0"/>
+          <w:numId w:val="24"/>
+        </w:numPr>
+        <w:rPr>
+          <w:rFonts w:ascii="Arial" w:hAnsi="Arial" w:cs="Arial"/>
+        </w:rPr>
+      </w:pPr>
+      <w:r>
+        <w:rPr>
+          <w:rFonts w:ascii="Arial" w:hAnsi="Arial" w:cs="Arial"/>
+        </w:rPr>
+        <w:t>Male – GenZ: $75,679.73</w:t>
+      </w:r>
+    </w:p>
+    <w:p>
+      <w:pPr>
+        <w:pStyle w:val="ListParagraph"/>
+        <w:numPr>
+          <w:ilvl w:val="0"/>
+          <w:numId w:val="24"/>
+        </w:numPr>
+        <w:rPr>
+          <w:rFonts w:ascii="Arial" w:hAnsi="Arial" w:cs="Arial"/>
+        </w:rPr>
+      </w:pPr>
+      <w:r>
+        <w:rPr>
+          <w:rFonts w:ascii="Arial" w:hAnsi="Arial" w:cs="Arial"/>
+        </w:rPr>
+        <w:t>Male – Boomers: $55,449.82</w:t>
+      </w:r>
+    </w:p>
+    <w:p>
+      <w:pPr>
+        <w:pStyle w:val="ListParagraph"/>
+        <w:numPr>
+          <w:ilvl w:val="0"/>
+          <w:numId w:val="24"/>
+        </w:numPr>
+        <w:rPr>
+          <w:rFonts w:ascii="Arial" w:hAnsi="Arial" w:cs="Arial"/>
+        </w:rPr>
+      </w:pPr>
+      <w:r>
+        <w:rPr>
+          <w:rFonts w:ascii="Arial" w:hAnsi="Arial" w:cs="Arial"/>
+        </w:rPr>
+        <w:t>Female – GenY: $50,750.71</w:t>
+      </w:r>
+    </w:p>
+    <w:p>
+      <w:pPr>
+        <w:pStyle w:val="ListParagraph"/>
+        <w:numPr>
+          <w:ilvl w:val="0"/>
+          <w:numId w:val="24"/>
+        </w:numPr>
+        <w:rPr>
+          <w:rFonts w:ascii="Arial" w:hAnsi="Arial" w:cs="Arial"/>
+        </w:rPr>
+      </w:pPr>
+      <w:r>
+        <w:rPr>
+          <w:rFonts w:ascii="Arial" w:hAnsi="Arial" w:cs="Arial"/>
+        </w:rPr>
+        <w:t>Female – GenX: $49,875.32</w:t>
+      </w:r>
+    </w:p>
+    <w:p>
+      <w:pPr>
+        <w:pStyle w:val="ListParagraph"/>
+        <w:numPr>
+          <w:ilvl w:val="0"/>
+          <w:numId w:val="24"/>
+        </w:numPr>
+        <w:rPr>
+          <w:rFonts w:ascii="Arial" w:hAnsi="Arial" w:cs="Arial"/>
+        </w:rPr>
+      </w:pPr>
+      <w:r>
+        <w:rPr>
+          <w:rFonts w:ascii="Arial" w:hAnsi="Arial" w:cs="Arial"/>
+        </w:rPr>
+        <w:t>Female – GenZ: $37,606.01</w:t>
+      </w:r>
+    </w:p>
+    <w:p>
+      <w:pPr>
+        <w:pStyle w:val="ListParagraph"/>
+        <w:numPr>
+          <w:ilvl w:val="0"/>
+          <w:numId w:val="24"/>
+        </w:numPr>
+        <w:rPr>
+          <w:rFonts w:ascii="Arial" w:hAnsi="Arial" w:cs="Arial"/>
+        </w:rPr>
+      </w:pPr>
+      <w:r>
+        <w:rPr>
+          <w:rFonts w:ascii="Arial" w:hAnsi="Arial" w:cs="Arial"/>
+        </w:rPr>
+        <w:t>Female – Boomers: $28,194.93</w:t>
+      </w:r>
+    </w:p>
+    <w:p>
+      <w:pPr>
+        <w:ind w:left="360"/>
+        <w:rPr>
+          <w:rFonts w:ascii="Arial" w:hAnsi="Arial" w:cs="Arial"/>
+        </w:rPr>
+      </w:pPr>
+    </w:p>
+    <w:p>
+      <w:pPr>
+        <w:rPr>
+          <w:rFonts w:ascii="Arial" w:hAnsi="Arial" w:cs="Arial"/>
+          <w:color w:val="2E74B5" w:themeColor="accent1" w:themeShade="BF"/>
+        </w:rPr>
+      </w:pPr>
+      <w:r>
+        <w:rPr>
+          <w:rFonts w:ascii="Arial" w:hAnsi="Arial" w:cs="Arial"/>
+          <w:b/>
+          <w:bCs/>
+          <w:color w:val="2E74B5" w:themeColor="accent1" w:themeShade="BF"/>
+        </w:rPr>
+        <w:t>Insight one:</w:t>
+      </w:r>
+      <w:r>
+        <w:rPr>
+          <w:rFonts w:ascii="Arial" w:hAnsi="Arial" w:cs="Arial"/>
+          <w:color w:val="2E74B5" w:themeColor="accent1" w:themeShade="BF"/>
+        </w:rPr>
+        <w:t xml:space="preserve"> </w:t>
+      </w:r>
+      <w:r>
+        <w:rPr>
+          <w:rFonts w:ascii="Arial" w:hAnsi="Arial" w:cs="Arial"/>
+          <w:color w:val="2E74B5" w:themeColor="accent1" w:themeShade="BF"/>
+        </w:rPr>
+        <w:t>Male customers across GenX</w:t>
+      </w:r>
+      <w:r>
+        <w:rPr>
+          <w:rFonts w:ascii="Arial" w:hAnsi="Arial" w:cs="Arial"/>
+          <w:color w:val="2E74B5" w:themeColor="accent1" w:themeShade="BF"/>
+        </w:rPr>
+        <w:t>(age:46-61)</w:t>
+      </w:r>
+      <w:r>
+        <w:rPr>
+          <w:rFonts w:ascii="Arial" w:hAnsi="Arial" w:cs="Arial"/>
+          <w:color w:val="2E74B5" w:themeColor="accent1" w:themeShade="BF"/>
+        </w:rPr>
+        <w:t xml:space="preserve"> and GenY</w:t>
+      </w:r>
+      <w:r>
+        <w:rPr>
+          <w:rFonts w:ascii="Arial" w:hAnsi="Arial" w:cs="Arial"/>
+          <w:color w:val="2E74B5" w:themeColor="accent1" w:themeShade="BF"/>
+        </w:rPr>
+        <w:t>(age:30-45)</w:t>
+      </w:r>
+      <w:r>
+        <w:rPr>
+          <w:rFonts w:ascii="Arial" w:hAnsi="Arial" w:cs="Arial"/>
+          <w:color w:val="2E74B5" w:themeColor="accent1" w:themeShade="BF"/>
+        </w:rPr>
+        <w:t xml:space="preserve"> generate the highest total revenue.</w:t>
+      </w:r>
+    </w:p>
+    <w:p>
+      <w:pPr>
+        <w:rPr>
+          <w:rFonts w:ascii="Arial" w:hAnsi="Arial" w:cs="Arial"/>
+          <w:color w:val="2E74B5" w:themeColor="accent1" w:themeShade="BF"/>
+        </w:rPr>
+      </w:pPr>
+    </w:p>
+    <w:p>
+      <w:r>
+        <w:rPr>
+          <w:rFonts w:ascii="Arial" w:hAnsi="Arial" w:cs="Arial"/>
+          <w:b/>
+          <w:bCs/>
+        </w:rPr>
+        <w:t>Subscription &amp; Purchase Frequency Analysis</w:t>
+      </w:r>
+      <w:r>
+        <w:rPr>
+          <w:rFonts w:ascii="Arial" w:hAnsi="Arial" w:cs="Arial"/>
+          <w:b/>
+          <w:bCs/>
+        </w:rPr>
+        <w:t>:</w:t>
+      </w:r>
+    </w:p>
+    <w:p>
+      <w:pPr>
+        <w:pStyle w:val="ListParagraph"/>
+        <w:numPr>
+          <w:ilvl w:val="0"/>
+          <w:numId w:val="24"/>
+        </w:numPr>
+        <w:rPr>
+          <w:rFonts w:ascii="Arial" w:hAnsi="Arial" w:cs="Arial"/>
+        </w:rPr>
+      </w:pPr>
+      <w:r>
+        <w:rPr>
+          <w:rFonts w:ascii="Arial" w:hAnsi="Arial" w:cs="Arial"/>
+          <w:b/>
+          <w:bCs/>
+        </w:rPr>
+        <w:t>Subscribed customers purchase amount and Non Subscribe puchase Puchase</w:t>
+      </w:r>
+    </w:p>
+    <w:p>
+      <w:pPr>
+        <w:pStyle w:val="ListParagraph"/>
+        <w:numPr>
+          <w:ilvl w:val="0"/>
+          <w:numId w:val="24"/>
+        </w:numPr>
+        <w:rPr>
+          <w:rFonts w:ascii="Arial" w:hAnsi="Arial" w:cs="Arial"/>
+        </w:rPr>
+      </w:pPr>
+      <w:r>
+        <w:rPr>
+          <w:rFonts w:ascii="Arial" w:hAnsi="Arial" w:cs="Arial"/>
+        </w:rPr>
+        <w:t>Subscribed customers do not significantly outperform non-subscribed customers in average purchase amount (~$60 across segments).</w:t>
+      </w:r>
+    </w:p>
+    <w:p>
+      <w:pPr>
+        <w:pStyle w:val="ListParagraph"/>
+        <w:numPr>
+          <w:ilvl w:val="0"/>
+          <w:numId w:val="24"/>
+        </w:numPr>
+        <w:rPr>
+          <w:rFonts w:ascii="Arial" w:hAnsi="Arial" w:cs="Arial"/>
+        </w:rPr>
+      </w:pPr>
+      <w:r>
+        <w:rPr>
+          <w:rFonts w:ascii="Arial" w:hAnsi="Arial" w:cs="Arial"/>
+        </w:rPr>
+        <w:t>Order volume is higher among non-subscribed customers.</w:t>
+      </w:r>
+    </w:p>
+    <w:p>
+      <w:pPr>
+        <w:rPr>
+          <w:rFonts w:ascii="Arial" w:hAnsi="Arial" w:cs="Arial"/>
+        </w:rPr>
+      </w:pPr>
+    </w:p>
+    <w:p>
+      <w:pPr>
+        <w:rPr>
+          <w:rFonts w:ascii="Arial" w:hAnsi="Arial" w:cs="Arial"/>
+          <w:color w:val="2E74B5" w:themeColor="accent1" w:themeShade="BF"/>
+        </w:rPr>
+      </w:pPr>
+      <w:r>
+        <w:rPr>
+          <w:rFonts w:ascii="Arial" w:hAnsi="Arial" w:cs="Arial"/>
+          <w:b/>
+          <w:bCs/>
+          <w:color w:val="2E74B5" w:themeColor="accent1" w:themeShade="BF"/>
+        </w:rPr>
+        <w:t xml:space="preserve">Insight </w:t>
+      </w:r>
+      <w:r>
+        <w:rPr>
+          <w:rFonts w:ascii="Arial" w:hAnsi="Arial" w:cs="Arial"/>
+          <w:b/>
+          <w:bCs/>
+          <w:color w:val="2E74B5" w:themeColor="accent1" w:themeShade="BF"/>
+        </w:rPr>
+        <w:t>Two</w:t>
+      </w:r>
+      <w:r>
+        <w:rPr>
+          <w:rFonts w:ascii="Arial" w:hAnsi="Arial" w:cs="Arial"/>
+          <w:b/>
+          <w:bCs/>
+          <w:color w:val="2E74B5" w:themeColor="accent1" w:themeShade="BF"/>
+        </w:rPr>
+        <w:t>:</w:t>
+      </w:r>
+      <w:r>
+        <w:rPr>
+          <w:rFonts w:ascii="Arial" w:hAnsi="Arial" w:cs="Arial"/>
+          <w:color w:val="2E74B5" w:themeColor="accent1" w:themeShade="BF"/>
+        </w:rPr>
+        <w:t xml:space="preserve"> </w:t>
+      </w:r>
+      <w:r>
+        <w:rPr>
+          <w:rFonts w:ascii="Arial" w:hAnsi="Arial" w:cs="Arial"/>
+          <w:color w:val="2E74B5" w:themeColor="accent1" w:themeShade="BF"/>
+        </w:rPr>
+        <w:t>Subscription status does not significantly increase purchase frequency or basket size.</w:t>
+      </w:r>
+    </w:p>
+    <w:p>
+      <w:pPr>
+        <w:rPr>
+          <w:rFonts w:ascii="Arial" w:hAnsi="Arial" w:cs="Arial"/>
+          <w:color w:val="2E74B5" w:themeColor="accent1" w:themeShade="BF"/>
+        </w:rPr>
+      </w:pPr>
+    </w:p>
+    <w:p>
+      <w:r>
+        <w:rPr>
+          <w:rFonts w:ascii="Arial" w:hAnsi="Arial" w:cs="Arial"/>
+          <w:b/>
+          <w:bCs/>
+        </w:rPr>
+        <w:t>Previous Purchases vs Spending Correlation</w:t>
+      </w:r>
+    </w:p>
+    <w:p>
+      <w:pPr>
+        <w:pStyle w:val="ListParagraph"/>
+        <w:numPr>
+          <w:ilvl w:val="0"/>
+          <w:numId w:val="24"/>
+        </w:numPr>
+        <w:rPr>
+          <w:rFonts w:ascii="Arial" w:hAnsi="Arial" w:cs="Arial"/>
+        </w:rPr>
+      </w:pPr>
+      <w:r>
+        <w:rPr>
+          <w:rFonts w:ascii="Arial" w:hAnsi="Arial" w:cs="Arial"/>
+        </w:rPr>
+        <w:t>Correlation between Previous Purchases and Spending: –0.01</w:t>
+      </w:r>
+    </w:p>
+    <w:p>
+      <w:pPr>
+        <w:rPr>
+          <w:rFonts w:ascii="Arial" w:hAnsi="Arial" w:cs="Arial"/>
+        </w:rPr>
+      </w:pPr>
+    </w:p>
+    <w:p>
+      <w:pPr>
+        <w:rPr>
+          <w:rFonts w:ascii="Arial" w:hAnsi="Arial" w:cs="Arial"/>
+          <w:color w:val="2E74B5" w:themeColor="accent1" w:themeShade="BF"/>
+        </w:rPr>
+      </w:pPr>
+      <w:r>
+        <w:rPr>
+          <w:rFonts w:ascii="Arial" w:hAnsi="Arial" w:cs="Arial"/>
+          <w:b/>
+          <w:bCs/>
+          <w:color w:val="2E74B5" w:themeColor="accent1" w:themeShade="BF"/>
+        </w:rPr>
+        <w:t xml:space="preserve">Insight </w:t>
+      </w:r>
+      <w:r>
+        <w:rPr>
+          <w:rFonts w:ascii="Arial" w:hAnsi="Arial" w:cs="Arial"/>
+          <w:b/>
+          <w:bCs/>
+          <w:color w:val="2E74B5" w:themeColor="accent1" w:themeShade="BF"/>
+        </w:rPr>
+        <w:t>Three</w:t>
+      </w:r>
+      <w:r>
+        <w:rPr>
+          <w:rFonts w:ascii="Arial" w:hAnsi="Arial" w:cs="Arial"/>
+          <w:b/>
+          <w:bCs/>
+          <w:color w:val="2E74B5" w:themeColor="accent1" w:themeShade="BF"/>
+        </w:rPr>
+        <w:t>:</w:t>
+      </w:r>
+      <w:r>
+        <w:rPr>
+          <w:rFonts w:ascii="Arial" w:hAnsi="Arial" w:cs="Arial"/>
+          <w:color w:val="2E74B5" w:themeColor="accent1" w:themeShade="BF"/>
+        </w:rPr>
+        <w:t xml:space="preserve"> </w:t>
+      </w:r>
+      <w:r>
+        <w:rPr>
+          <w:rFonts w:ascii="Arial" w:hAnsi="Arial" w:cs="Arial"/>
+          <w:color w:val="2E74B5" w:themeColor="accent1" w:themeShade="BF"/>
+        </w:rPr>
+        <w:t>There is no meaningful relationship between purchase history and spending.</w:t>
+      </w:r>
+    </w:p>
+    <w:p>
+      <w:r>
+        <w:rPr>
+          <w:rFonts w:ascii="Arial" w:hAnsi="Arial" w:cs="Arial"/>
+          <w:b/>
+          <w:bCs/>
+        </w:rPr>
+        <w:t>KPI</w:t>
+      </w:r>
+    </w:p>
+    <w:p>
+      <w:pPr>
+        <w:pStyle w:val="ListParagraph"/>
+        <w:numPr>
+          <w:ilvl w:val="0"/>
+          <w:numId w:val="24"/>
+        </w:numPr>
+        <w:rPr>
+          <w:rFonts w:ascii="Arial" w:hAnsi="Arial" w:cs="Arial"/>
+        </w:rPr>
+      </w:pPr>
+      <w:r>
+        <w:rPr>
+          <w:rFonts w:ascii="Arial" w:hAnsi="Arial" w:cs="Arial"/>
+        </w:rPr>
+        <w:t>Average Lifetime Spend per Customer</w:t>
+      </w:r>
+      <w:r>
+        <w:rPr>
+          <w:rFonts w:ascii="Arial" w:hAnsi="Arial" w:cs="Arial"/>
+        </w:rPr>
+        <w:t xml:space="preserve">: </w:t>
+      </w:r>
+      <w:r>
+        <w:rPr>
+          <w:rFonts w:ascii="Arial" w:hAnsi="Arial" w:cs="Arial"/>
+        </w:rPr>
+        <w:t>$127.8</w:t>
+      </w:r>
+    </w:p>
+    <w:p>
+      <w:pPr>
+        <w:pStyle w:val="ListParagraph"/>
+        <w:numPr>
+          <w:ilvl w:val="0"/>
+          <w:numId w:val="24"/>
+        </w:numPr>
+        <w:rPr>
+          <w:rFonts w:ascii="Arial" w:hAnsi="Arial" w:cs="Arial"/>
+        </w:rPr>
+      </w:pPr>
+      <w:r>
+        <w:rPr>
+          <w:rFonts w:ascii="Arial" w:hAnsi="Arial" w:cs="Arial"/>
+        </w:rPr>
+        <w:t>Purchase Frequency Distribution</w:t>
+      </w:r>
+    </w:p>
+    <w:p>
+      <w:pPr>
+        <w:pStyle w:val="ListParagraph"/>
+        <w:numPr>
+          <w:ilvl w:val="3"/>
+          <w:numId w:val="34"/>
+        </w:numPr>
+        <w:rPr>
+          <w:rFonts w:ascii="Arial" w:hAnsi="Arial" w:cs="Arial"/>
+        </w:rPr>
+      </w:pPr>
+      <w:r>
+        <w:rPr>
+          <w:rFonts w:ascii="Arial" w:hAnsi="Arial" w:cs="Arial"/>
+        </w:rPr>
+        <w:t>Every 3 Months – 1,253 customers</w:t>
+      </w:r>
+    </w:p>
+    <w:p>
+      <w:pPr>
+        <w:pStyle w:val="ListParagraph"/>
+        <w:numPr>
+          <w:ilvl w:val="3"/>
+          <w:numId w:val="34"/>
+        </w:numPr>
+        <w:rPr>
+          <w:rFonts w:ascii="Arial" w:hAnsi="Arial" w:cs="Arial"/>
+        </w:rPr>
+      </w:pPr>
+      <w:r>
+        <w:rPr>
+          <w:rFonts w:ascii="Arial" w:hAnsi="Arial" w:cs="Arial"/>
+        </w:rPr>
+        <w:t>Annually – 1,211 customers</w:t>
+      </w:r>
+    </w:p>
+    <w:p>
+      <w:pPr>
+        <w:pStyle w:val="ListParagraph"/>
+        <w:numPr>
+          <w:ilvl w:val="3"/>
+          <w:numId w:val="34"/>
+        </w:numPr>
+        <w:rPr>
+          <w:rFonts w:ascii="Arial" w:hAnsi="Arial" w:cs="Arial"/>
+        </w:rPr>
+      </w:pPr>
+      <w:r>
+        <w:rPr>
+          <w:rFonts w:ascii="Arial" w:hAnsi="Arial" w:cs="Arial"/>
+        </w:rPr>
+        <w:t>Quarterly – 1,196 customers</w:t>
+      </w:r>
+    </w:p>
+    <w:p>
+      <w:pPr>
+        <w:pStyle w:val="ListParagraph"/>
+        <w:numPr>
+          <w:ilvl w:val="3"/>
+          <w:numId w:val="34"/>
+        </w:numPr>
+        <w:rPr>
+          <w:rFonts w:ascii="Arial" w:hAnsi="Arial" w:cs="Arial"/>
+        </w:rPr>
+      </w:pPr>
+      <w:r>
+        <w:rPr>
+          <w:rFonts w:ascii="Arial" w:hAnsi="Arial" w:cs="Arial"/>
+        </w:rPr>
+        <w:t>Monthly – 1,173 customers</w:t>
+      </w:r>
+    </w:p>
+    <w:p>
+      <w:pPr>
+        <w:pStyle w:val="ListParagraph"/>
+        <w:numPr>
+          <w:ilvl w:val="0"/>
+          <w:numId w:val="24"/>
+        </w:numPr>
+        <w:rPr>
+          <w:rFonts w:ascii="Arial" w:hAnsi="Arial" w:cs="Arial"/>
+        </w:rPr>
+      </w:pPr>
+      <w:r>
+        <w:rPr>
+          <w:rFonts w:ascii="Arial" w:hAnsi="Arial" w:cs="Arial"/>
+        </w:rPr>
+        <w:t>High-Value Customer Share: 20%</w:t>
+      </w:r>
+    </w:p>
+    <w:p>
+      <w:pPr>
+        <w:rPr>
+          <w:rFonts w:ascii="Arial" w:hAnsi="Arial" w:cs="Arial"/>
+        </w:rPr>
+      </w:pPr>
+    </w:p>
+    <w:p>
+      <w:pPr>
+        <w:rPr>
+          <w:rFonts w:ascii="Arial" w:hAnsi="Arial" w:cs="Arial"/>
+        </w:rPr>
+      </w:pPr>
+    </w:p>
+    <w:p>
+      <w:pPr>
+        <w:rPr>
+          <w:rFonts w:ascii="Arial" w:hAnsi="Arial" w:cs="Arial"/>
+          <w:color w:val="2E74B5" w:themeColor="accent1" w:themeShade="BF"/>
+        </w:rPr>
+      </w:pPr>
+      <w:r>
+        <w:rPr>
+          <w:rFonts w:ascii="Arial" w:hAnsi="Arial" w:cs="Arial"/>
+          <w:b/>
+          <w:bCs/>
+          <w:color w:val="2E74B5" w:themeColor="accent1" w:themeShade="BF"/>
+        </w:rPr>
+        <w:t xml:space="preserve">Insight </w:t>
+      </w:r>
+      <w:r>
+        <w:rPr>
+          <w:rFonts w:ascii="Arial" w:hAnsi="Arial" w:cs="Arial"/>
+          <w:b/>
+          <w:bCs/>
+          <w:color w:val="2E74B5" w:themeColor="accent1" w:themeShade="BF"/>
+        </w:rPr>
+        <w:t>Four</w:t>
+      </w:r>
+      <w:r>
+        <w:rPr>
+          <w:rFonts w:ascii="Arial" w:hAnsi="Arial" w:cs="Arial"/>
+          <w:b/>
+          <w:bCs/>
+          <w:color w:val="2E74B5" w:themeColor="accent1" w:themeShade="BF"/>
+        </w:rPr>
+        <w:t>:</w:t>
+      </w:r>
+      <w:r>
+        <w:rPr>
+          <w:rFonts w:ascii="Arial" w:hAnsi="Arial" w:cs="Arial"/>
+          <w:color w:val="2E74B5" w:themeColor="accent1" w:themeShade="BF"/>
+        </w:rPr>
+        <w:t xml:space="preserve"> </w:t>
+      </w:r>
+      <w:r>
+        <w:rPr>
+          <w:rFonts w:ascii="Arial" w:hAnsi="Arial" w:cs="Arial"/>
+          <w:color w:val="2E74B5" w:themeColor="accent1" w:themeShade="BF"/>
+        </w:rPr>
+        <w:t>A small group (top 20%) contributes disproportionately higher value.</w:t>
+      </w:r>
+    </w:p>
+    <w:p>
+      <w:pPr>
+        <w:rPr>
+          <w:rFonts w:ascii="Arial" w:hAnsi="Arial" w:cs="Arial"/>
+          <w:color w:val="2E74B5" w:themeColor="accent1" w:themeShade="BF"/>
+        </w:rPr>
+      </w:pPr>
+      <w:r>
+        <w:rPr>
+          <w:rFonts w:ascii="Arial" w:hAnsi="Arial" w:cs="Arial"/>
+          <w:color w:val="2E74B5" w:themeColor="accent1" w:themeShade="BF"/>
+        </w:rPr>
+        <w:t>This is the most strategically important segment.</w:t>
+      </w:r>
+    </w:p>
+    <w:p>
+      <w:pPr>
+        <w:rPr>
+          <w:rFonts w:ascii="Arial" w:hAnsi="Arial" w:cs="Arial"/>
+          <w:color w:val="2E74B5" w:themeColor="accent1" w:themeShade="BF"/>
+        </w:rPr>
+      </w:pPr>
+    </w:p>
+    <w:p>
+      <w:pPr>
+        <w:rPr>
+          <w:rFonts w:ascii="Arial" w:hAnsi="Arial" w:cs="Arial"/>
+          <w:b/>
+          <w:bCs/>
+        </w:rPr>
+      </w:pPr>
+      <w:r>
+        <w:rPr>
+          <w:rFonts w:ascii="Arial" w:hAnsi="Arial" w:cs="Arial"/>
+          <w:b/>
+          <w:bCs/>
+        </w:rPr>
+        <w:t>Recommendations to</w:t>
+      </w:r>
+      <w:r>
+        <w:rPr>
+          <w:rFonts w:ascii="Arial" w:hAnsi="Arial" w:cs="Arial"/>
+          <w:b/>
+          <w:bCs/>
+        </w:rPr>
+        <w:t xml:space="preserve"> Customer segments</w:t>
+      </w:r>
+      <w:r>
+        <w:rPr>
+          <w:rFonts w:ascii="Arial" w:hAnsi="Arial" w:cs="Arial"/>
+          <w:b/>
+          <w:bCs/>
+        </w:rPr>
+        <w:t>:</w:t>
+      </w:r>
+    </w:p>
+    <w:p>
+      <w:pPr>
+        <w:pStyle w:val="ListParagraph"/>
+        <w:numPr>
+          <w:ilvl w:val="0"/>
+          <w:numId w:val="26"/>
+        </w:numPr>
+        <w:rPr>
+          <w:rFonts w:ascii="Arial" w:hAnsi="Arial" w:cs="Arial"/>
+        </w:rPr>
+      </w:pPr>
+      <w:r>
+        <w:rPr>
+          <w:rFonts w:ascii="Arial" w:hAnsi="Arial" w:cs="Arial"/>
+        </w:rPr>
+        <w:t>Focus personalized campaigns on GenX &amp; GenY male customers</w:t>
+      </w:r>
+    </w:p>
+    <w:p>
+      <w:pPr>
+        <w:pStyle w:val="ListParagraph"/>
+        <w:numPr>
+          <w:ilvl w:val="0"/>
+          <w:numId w:val="26"/>
+        </w:numPr>
+        <w:rPr>
+          <w:rFonts w:ascii="Arial" w:hAnsi="Arial" w:cs="Arial"/>
+        </w:rPr>
+      </w:pPr>
+      <w:r>
+        <w:rPr>
+          <w:rFonts w:ascii="Arial" w:hAnsi="Arial" w:cs="Arial"/>
+        </w:rPr>
+        <w:t>Identify customers above the $83.94 average spend threshold</w:t>
+      </w:r>
+    </w:p>
+    <w:p>
+      <w:pPr>
+        <w:rPr>
+          <w:rFonts w:ascii="Arial" w:hAnsi="Arial" w:cs="Arial"/>
+        </w:rPr>
+      </w:pPr>
+    </w:p>
+    <w:p>
+      <w:pPr>
+        <w:tabs>
+          <w:tab w:val="left" w:pos="3221"/>
+        </w:tabs>
+        <w:rPr>
+          <w:rFonts w:ascii="Arial" w:hAnsi="Arial" w:cs="Arial"/>
+          <w:b/>
+          <w:bCs/>
+        </w:rPr>
+      </w:pPr>
+      <w:r>
+        <w:rPr>
+          <w:rFonts w:ascii="Arial" w:hAnsi="Arial" w:cs="Arial"/>
+          <w:b/>
+          <w:bCs/>
+        </w:rPr>
+        <w:t>Conclusion:</w:t>
+      </w:r>
+    </w:p>
+    <w:p>
+      <w:pPr>
+        <w:rPr>
+          <w:rFonts w:ascii="Arial" w:hAnsi="Arial" w:cs="Arial"/>
+        </w:rPr>
+      </w:pPr>
+      <w:r>
+        <w:rPr>
+          <w:rFonts w:ascii="Arial" w:hAnsi="Arial" w:cs="Arial"/>
+        </w:rPr>
+        <w:t>Customer lifetime value is concentrated within specific demographic segments rather than being evenly distributed. Since subscription and repeat purchases do not significantly increase per-order spending, revenue growth should focus on identifying and nurturing high-value customer segments through personalized engagement strategies rather than broad discount-based campaigns.</w:t>
+      </w:r>
     </w:p>
     <w:sectPr>
       <w:pgSz w:w="12240" w:h="15840"/>
@@ -3499,6 +5252,92 @@
     </w:lvl>
   </w:abstractNum>
   <w:abstractNum w:abstractNumId="32" w15:restartNumberingAfterBreak="0">
+    <w:nsid w:val="75C301C2"/>
+    <w:multiLevelType w:val="multilevel"/>
+    <w:tmpl w:val="0409001D"/>
+    <w:lvl w:ilvl="0">
+      <w:start w:val="1"/>
+      <w:numFmt w:val="decimal"/>
+      <w:lvlText w:val="%1)"/>
+      <w:lvlJc w:val="left"/>
+      <w:pPr>
+        <w:ind w:left="360" w:hanging="360"/>
+      </w:pPr>
+    </w:lvl>
+    <w:lvl w:ilvl="1">
+      <w:start w:val="1"/>
+      <w:numFmt w:val="lowerLetter"/>
+      <w:lvlText w:val="%2)"/>
+      <w:lvlJc w:val="left"/>
+      <w:pPr>
+        <w:ind w:left="720" w:hanging="360"/>
+      </w:pPr>
+    </w:lvl>
+    <w:lvl w:ilvl="2">
+      <w:start w:val="1"/>
+      <w:numFmt w:val="lowerRoman"/>
+      <w:lvlText w:val="%3)"/>
+      <w:lvlJc w:val="left"/>
+      <w:pPr>
+        <w:ind w:left="1080" w:hanging="360"/>
+      </w:pPr>
+    </w:lvl>
+    <w:lvl w:ilvl="3">
+      <w:start w:val="1"/>
+      <w:numFmt w:val="decimal"/>
+      <w:lvlText w:val="(%4)"/>
+      <w:lvlJc w:val="left"/>
+      <w:pPr>
+        <w:ind w:left="1440" w:hanging="360"/>
+      </w:pPr>
+    </w:lvl>
+    <w:lvl w:ilvl="4">
+      <w:start w:val="1"/>
+      <w:numFmt w:val="lowerLetter"/>
+      <w:lvlText w:val="(%5)"/>
+      <w:lvlJc w:val="left"/>
+      <w:pPr>
+        <w:ind w:left="1800" w:hanging="360"/>
+      </w:pPr>
+    </w:lvl>
+    <w:lvl w:ilvl="5">
+      <w:start w:val="1"/>
+      <w:numFmt w:val="lowerRoman"/>
+      <w:lvlText w:val="(%6)"/>
+      <w:lvlJc w:val="left"/>
+      <w:pPr>
+        <w:ind w:left="2160" w:hanging="360"/>
+      </w:pPr>
+    </w:lvl>
+    <w:lvl w:ilvl="6">
+      <w:start w:val="1"/>
+      <w:numFmt w:val="decimal"/>
+      <w:lvlText w:val="%7."/>
+      <w:lvlJc w:val="left"/>
+      <w:pPr>
+        <w:ind w:left="2520" w:hanging="360"/>
+      </w:pPr>
+    </w:lvl>
+    <w:lvl w:ilvl="7">
+      <w:start w:val="1"/>
+      <w:numFmt w:val="lowerLetter"/>
+      <w:lvlText w:val="%8."/>
+      <w:lvlJc w:val="left"/>
+      <w:pPr>
+        <w:ind w:left="2880" w:hanging="360"/>
+      </w:pPr>
+    </w:lvl>
+    <w:lvl w:ilvl="8">
+      <w:start w:val="1"/>
+      <w:numFmt w:val="lowerRoman"/>
+      <w:lvlText w:val="%9."/>
+      <w:lvlJc w:val="left"/>
+      <w:pPr>
+        <w:ind w:left="3240" w:hanging="360"/>
+      </w:pPr>
+    </w:lvl>
+  </w:abstractNum>
+  <w:abstractNum w:abstractNumId="33" w15:restartNumberingAfterBreak="0">
     <w:nsid w:val="7D8C2C6D"/>
     <w:multiLevelType w:val="multilevel"/>
     <w:tmpl w:val="04090023"/>
@@ -3652,7 +5491,7 @@
     <w:abstractNumId w:val="11"/>
   </w:num>
   <w:num w:numId="23" w16cid:durableId="226302223">
-    <w:abstractNumId w:val="32"/>
+    <w:abstractNumId w:val="33"/>
   </w:num>
   <w:num w:numId="24" w16cid:durableId="634718305">
     <w:abstractNumId w:val="19"/>
@@ -3683,6 +5522,9 @@
   </w:num>
   <w:num w:numId="33" w16cid:durableId="1374581025">
     <w:abstractNumId w:val="27"/>
+  </w:num>
+  <w:num w:numId="34" w16cid:durableId="1489861462">
+    <w:abstractNumId w:val="32"/>
   </w:num>
 </w:numbering>
 </file>
@@ -4081,7 +5923,7 @@
   <w:style w:type="paragraph" w:default="1" w:styleId="Normal">
     <w:name w:val="Normal"/>
     <w:qFormat/>
-    <w:rsid w:val="00071533"/>
+    <w:rsid w:val="0068169E"/>
   </w:style>
   <w:style w:type="paragraph" w:styleId="Heading1">
     <w:name w:val="heading 1"/>

</xml_diff>